<commit_message>
feat(storefront): orchestrate guided generation
</commit_message>
<xml_diff>
--- a/docs/VESKIFY_SDD_v1.1.docx
+++ b/docs/VESKIFY_SDD_v1.1.docx
@@ -29026,6 +29026,29 @@
     <w:p>
       <w:r>
         <w:t>Traceability: §4.1; §6.2 FR-009, FR-011, FR-013–FR-016, FR-040, FR-051, FR-052; §9.1; §12.8; §15.3–§15.5; §16.2 and §16.5; §17.1; §21.2 AC-001, AC-002, AC-013, AC-016, AC-021, AC-022.</w:t>
+      </w:r>
+    </w:p>
+    <w:p>
+      <w:pPr>
+        <w:pStyle w:val="Heading1"/>
+      </w:pPr>
+      <w:r>
+        <w:t>P3-10 — Deterministic guided storefront generation orchestrator</w:t>
+      </w:r>
+    </w:p>
+    <w:p>
+      <w:r>
+        <w:t>The guided-generation application boundary composes P3-05 brand foundation, P3-06 template selection and P3-08 initial storefront materialization in that fixed order. It returns one immutable, reviewable in-memory result containing the stage plans, validated snapshot when successful, assumptions, warnings, blockers, provenance and stage-labelled diagnostics. It does not create or persist a Project.</w:t>
+      </w:r>
+    </w:p>
+    <w:p>
+      <w:r>
+        <w:t>The boundary accepts only a validated brief, preferred template override, explicit project and snapshot identifiers, catalogue reference and createdAt. It uses no runtime clock, randomness, provider, browser, network or catalogue access. A blocked stage prevents later stages from running; unexecuted stages are marked not-run and blocked results contain no generated snapshot.</w:t>
+      </w:r>
+    </w:p>
+    <w:p>
+      <w:r>
+        <w:t>Diagnostics retain their source stage and original stable code. Cross-stage brief IDs, selection fingerprint, template plan ID, BrandSystem and snapshot metadata are checked before exposure to the later onboarding review and project-creation handoff. Traceability: §4.1; §6.2 FR-009, FR-010, FR-011, FR-013–FR-016, FR-040, FR-051–FR-054; §12.8; §15.3–§15.5; §16.2, §16.5; §17.1; §21.2 AC-001, AC-002, AC-013, AC-016, AC-023, AC-024.</w:t>
       </w:r>
     </w:p>
     <w:sectPr>

</xml_diff>

<commit_message>
Add atomic project aggregate creation
</commit_message>
<xml_diff>
--- a/docs/VESKIFY_SDD_v1.1.docx
+++ b/docs/VESKIFY_SDD_v1.1.docx
@@ -17958,6 +17958,17 @@
     </w:p>
     <w:p>
       <w:pPr>
+        <w:pStyle w:val="ListBullet"/>
+      </w:pPr>
+      <w:r>
+        <w:rPr>
+          <w:rFonts w:ascii="Aptos" w:hAnsi="Aptos" w:eastAsia="Aptos"/>
+        </w:rPr>
+        <w:t>Project creation is a separate, pre-editor persistence boundary. Once a later application workflow has produced a complete validated ProjectAggregate, it may submit that aggregate to ProjectRepository.create; creation does not publish, overwrite an existing project, or invent publish/restore history (FR-001, FR-009, FR-041, FR-044, FR-045, NFR-006, AC-001, AC-008, AC-010, AC-011, AC-023).</w:t>
+      </w:r>
+    </w:p>
+    <w:p>
+      <w:pPr>
         <w:pStyle w:val="Heading2"/>
         <w:keepNext/>
         <w:keepLines/>
@@ -19979,6 +19990,14 @@
       </w:r>
     </w:p>
     <w:p>
+      <w:r>
+        <w:rPr>
+          <w:rFonts w:ascii="Aptos" w:hAnsi="Aptos" w:eastAsia="Aptos"/>
+        </w:rPr>
+        <w:t>The canonical repository boundary accepts atomic creation of a complete validated ProjectAggregate through ProjectRepository.create(aggregate). The repository validates the project, catalogue, registered snapshot composition, snapshot references and optional history metadata before writing. Project, catalogue, snapshots and metadata are inserted as one operation; an invalid aggregate or existing project, catalogue or snapshot identity leaves all adapters unchanged. Creation returns a detached validated aggregate, marks only the current draft as managed for later bounded retention, and preserves supplied metadata without fabricating publish or restore events. Project construction and onboarding remain application boundaries separate from this persistence operation (FR-001, FR-009, FR-041, FR-044, FR-045, FR-050, NFR-006, AC-001, AC-008, AC-010, AC-011, AC-023).</w:t>
+      </w:r>
+    </w:p>
+    <w:p>
       <w:bookmarkStart w:id="18" w:name="s16"/>
       <w:pPr>
         <w:pStyle w:val="Heading1"/>
@@ -20535,6 +20554,17 @@
           <w:rFonts w:ascii="Aptos" w:hAnsi="Aptos" w:eastAsia="Aptos"/>
         </w:rPr>
         <w:t>Application services: create project, generate storefront, apply proposal, publish, restore and import catalogue.</w:t>
+      </w:r>
+    </w:p>
+    <w:p>
+      <w:pPr>
+        <w:pStyle w:val="ListBullet"/>
+      </w:pPr>
+      <w:r>
+        <w:rPr>
+          <w:rFonts w:ascii="Aptos" w:hAnsi="Aptos" w:eastAsia="Aptos"/>
+        </w:rPr>
+        <w:t>Project construction remains an application concern; the storage adapter owns only atomic persistence of a complete validated aggregate through ProjectRepository.create.</w:t>
       </w:r>
     </w:p>
     <w:p>
@@ -21591,23 +21621,12 @@
             </w:r>
             <w:r>
               <w:rPr>
-                <w:rFonts w:ascii="Aptos" w:hAnsi="Aptos" w:eastAsia="Aptos"/>
-              </w:rPr>
-              <w:br/>
-            </w:r>
-            <w:r>
-              <w:rPr>
                 <w:rFonts w:ascii="Liberation Mono" w:hAnsi="Liberation Mono" w:eastAsia="Liberation Mono"/>
                 <w:color w:val="1F2937"/>
                 <w:sz w:val="14"/>
               </w:rPr>
+              <w:br/>
               <w:t xml:space="preserve">  id: string;</w:t>
-            </w:r>
-            <w:r>
-              <w:rPr>
-                <w:rFonts w:ascii="Aptos" w:hAnsi="Aptos" w:eastAsia="Aptos"/>
-              </w:rPr>
-              <w:br/>
             </w:r>
             <w:r>
               <w:rPr>
@@ -21615,13 +21634,8 @@
                 <w:color w:val="1F2937"/>
                 <w:sz w:val="14"/>
               </w:rPr>
+              <w:br/>
               <w:t xml:space="preserve">  revision: number;</w:t>
-            </w:r>
-            <w:r>
-              <w:rPr>
-                <w:rFonts w:ascii="Aptos" w:hAnsi="Aptos" w:eastAsia="Aptos"/>
-              </w:rPr>
-              <w:br/>
             </w:r>
             <w:r>
               <w:rPr>
@@ -21629,13 +21643,8 @@
                 <w:color w:val="1F2937"/>
                 <w:sz w:val="14"/>
               </w:rPr>
+              <w:br/>
               <w:t xml:space="preserve">  contentFingerprint: string;</w:t>
-            </w:r>
-            <w:r>
-              <w:rPr>
-                <w:rFonts w:ascii="Aptos" w:hAnsi="Aptos" w:eastAsia="Aptos"/>
-              </w:rPr>
-              <w:br/>
             </w:r>
             <w:r>
               <w:rPr>
@@ -21643,13 +21652,8 @@
                 <w:color w:val="1F2937"/>
                 <w:sz w:val="14"/>
               </w:rPr>
+              <w:br/>
               <w:t>};</w:t>
-            </w:r>
-            <w:r>
-              <w:rPr>
-                <w:rFonts w:ascii="Aptos" w:hAnsi="Aptos" w:eastAsia="Aptos"/>
-              </w:rPr>
-              <w:br/>
             </w:r>
             <w:r>
               <w:rPr>
@@ -21657,13 +21661,8 @@
                 <w:color w:val="1F2937"/>
                 <w:sz w:val="14"/>
               </w:rPr>
+              <w:br/>
               <w:t>type PublishExpectation = {</w:t>
-            </w:r>
-            <w:r>
-              <w:rPr>
-                <w:rFonts w:ascii="Aptos" w:hAnsi="Aptos" w:eastAsia="Aptos"/>
-              </w:rPr>
-              <w:br/>
             </w:r>
             <w:r>
               <w:rPr>
@@ -21671,13 +21670,8 @@
                 <w:color w:val="1F2937"/>
                 <w:sz w:val="14"/>
               </w:rPr>
+              <w:br/>
               <w:t xml:space="preserve">  projectRevision: number;</w:t>
-            </w:r>
-            <w:r>
-              <w:rPr>
-                <w:rFonts w:ascii="Aptos" w:hAnsi="Aptos" w:eastAsia="Aptos"/>
-              </w:rPr>
-              <w:br/>
             </w:r>
             <w:r>
               <w:rPr>
@@ -21685,13 +21679,8 @@
                 <w:color w:val="1F2937"/>
                 <w:sz w:val="14"/>
               </w:rPr>
+              <w:br/>
               <w:t xml:space="preserve">  draft: PublishSnapshotExpectation;</w:t>
-            </w:r>
-            <w:r>
-              <w:rPr>
-                <w:rFonts w:ascii="Aptos" w:hAnsi="Aptos" w:eastAsia="Aptos"/>
-              </w:rPr>
-              <w:br/>
             </w:r>
             <w:r>
               <w:rPr>
@@ -21699,13 +21688,8 @@
                 <w:color w:val="1F2937"/>
                 <w:sz w:val="14"/>
               </w:rPr>
+              <w:br/>
               <w:t xml:space="preserve">  published: PublishSnapshotExpectation;</w:t>
-            </w:r>
-            <w:r>
-              <w:rPr>
-                <w:rFonts w:ascii="Aptos" w:hAnsi="Aptos" w:eastAsia="Aptos"/>
-              </w:rPr>
-              <w:br/>
             </w:r>
             <w:r>
               <w:rPr>
@@ -21713,13 +21697,8 @@
                 <w:color w:val="1F2937"/>
                 <w:sz w:val="14"/>
               </w:rPr>
+              <w:br/>
               <w:t>};</w:t>
-            </w:r>
-            <w:r>
-              <w:rPr>
-                <w:rFonts w:ascii="Aptos" w:hAnsi="Aptos" w:eastAsia="Aptos"/>
-              </w:rPr>
-              <w:br/>
             </w:r>
             <w:r>
               <w:rPr>
@@ -21727,13 +21706,8 @@
                 <w:color w:val="1F2937"/>
                 <w:sz w:val="14"/>
               </w:rPr>
-              <w:t>interface ProjectRepository {</w:t>
-            </w:r>
-            <w:r>
-              <w:rPr>
-                <w:rFonts w:ascii="Aptos" w:hAnsi="Aptos" w:eastAsia="Aptos"/>
-              </w:rPr>
               <w:br/>
+              <w:t>type ProjectAggregate = {</w:t>
             </w:r>
             <w:r>
               <w:rPr>
@@ -21741,13 +21715,8 @@
                 <w:color w:val="1F2937"/>
                 <w:sz w:val="14"/>
               </w:rPr>
-              <w:t xml:space="preserve">  list(): Promise&lt;ProjectSummary[]&gt;;</w:t>
-            </w:r>
-            <w:r>
-              <w:rPr>
-                <w:rFonts w:ascii="Aptos" w:hAnsi="Aptos" w:eastAsia="Aptos"/>
-              </w:rPr>
               <w:br/>
+              <w:t xml:space="preserve">  project: Project;</w:t>
             </w:r>
             <w:r>
               <w:rPr>
@@ -21755,13 +21724,8 @@
                 <w:color w:val="1F2937"/>
                 <w:sz w:val="14"/>
               </w:rPr>
-              <w:t xml:space="preserve">  get(projectId: string): Promise&lt;ProjectAggregate&gt;;</w:t>
-            </w:r>
-            <w:r>
-              <w:rPr>
-                <w:rFonts w:ascii="Aptos" w:hAnsi="Aptos" w:eastAsia="Aptos"/>
-              </w:rPr>
               <w:br/>
+              <w:t xml:space="preserve">  catalogue: CatalogueDisplayModel;</w:t>
             </w:r>
             <w:r>
               <w:rPr>
@@ -21769,13 +21733,8 @@
                 <w:color w:val="1F2937"/>
                 <w:sz w:val="14"/>
               </w:rPr>
-              <w:t xml:space="preserve">  saveDraft(projectId: string, snapshot: StorefrontSnapshot): Promise&lt;void&gt;;</w:t>
-            </w:r>
-            <w:r>
-              <w:rPr>
-                <w:rFonts w:ascii="Aptos" w:hAnsi="Aptos" w:eastAsia="Aptos"/>
-              </w:rPr>
               <w:br/>
+              <w:t xml:space="preserve">  snapshots: StorefrontSnapshot[];</w:t>
             </w:r>
             <w:r>
               <w:rPr>
@@ -21783,13 +21742,8 @@
                 <w:color w:val="1F2937"/>
                 <w:sz w:val="14"/>
               </w:rPr>
-              <w:t xml:space="preserve">  publish(projectId: string, expectation: PublishExpectation): Promise&lt;ProjectAggregate&gt;;</w:t>
-            </w:r>
-            <w:r>
-              <w:rPr>
-                <w:rFonts w:ascii="Aptos" w:hAnsi="Aptos" w:eastAsia="Aptos"/>
-              </w:rPr>
               <w:br/>
+              <w:t xml:space="preserve">  snapshotHistoryMetadata?: SnapshotHistoryMetadata[];</w:t>
             </w:r>
             <w:r>
               <w:rPr>
@@ -21797,13 +21751,8 @@
                 <w:color w:val="1F2937"/>
                 <w:sz w:val="14"/>
               </w:rPr>
-              <w:t xml:space="preserve">  restore(projectId: string, snapshotId: string): Promise&lt;StorefrontSnapshot&gt;;</w:t>
-            </w:r>
-            <w:r>
-              <w:rPr>
-                <w:rFonts w:ascii="Aptos" w:hAnsi="Aptos" w:eastAsia="Aptos"/>
-              </w:rPr>
               <w:br/>
+              <w:t>};</w:t>
             </w:r>
             <w:r>
               <w:rPr>
@@ -21811,6 +21760,70 @@
                 <w:color w:val="1F2937"/>
                 <w:sz w:val="14"/>
               </w:rPr>
+              <w:br/>
+              <w:t>interface ProjectRepository {</w:t>
+            </w:r>
+            <w:r>
+              <w:rPr>
+                <w:rFonts w:ascii="Liberation Mono" w:hAnsi="Liberation Mono" w:eastAsia="Liberation Mono"/>
+                <w:color w:val="1F2937"/>
+                <w:sz w:val="14"/>
+              </w:rPr>
+              <w:br/>
+              <w:t xml:space="preserve">  list(): Promise&lt;ProjectSummary[]&gt;;</w:t>
+            </w:r>
+            <w:r>
+              <w:rPr>
+                <w:rFonts w:ascii="Liberation Mono" w:hAnsi="Liberation Mono" w:eastAsia="Liberation Mono"/>
+                <w:color w:val="1F2937"/>
+                <w:sz w:val="14"/>
+              </w:rPr>
+              <w:br/>
+              <w:t xml:space="preserve">  get(projectId: string): Promise&lt;ProjectAggregate&gt;;</w:t>
+            </w:r>
+            <w:r>
+              <w:rPr>
+                <w:rFonts w:ascii="Liberation Mono" w:hAnsi="Liberation Mono" w:eastAsia="Liberation Mono"/>
+                <w:color w:val="1F2937"/>
+                <w:sz w:val="14"/>
+              </w:rPr>
+              <w:br/>
+              <w:t xml:space="preserve">  create(aggregate: ProjectAggregate): Promise&lt;ProjectAggregate&gt;;</w:t>
+            </w:r>
+            <w:r>
+              <w:rPr>
+                <w:rFonts w:ascii="Liberation Mono" w:hAnsi="Liberation Mono" w:eastAsia="Liberation Mono"/>
+                <w:color w:val="1F2937"/>
+                <w:sz w:val="14"/>
+              </w:rPr>
+              <w:br/>
+              <w:t xml:space="preserve">  saveDraft(projectId: string, snapshot: StorefrontSnapshot): Promise&lt;void&gt;;</w:t>
+            </w:r>
+            <w:r>
+              <w:rPr>
+                <w:rFonts w:ascii="Liberation Mono" w:hAnsi="Liberation Mono" w:eastAsia="Liberation Mono"/>
+                <w:color w:val="1F2937"/>
+                <w:sz w:val="14"/>
+              </w:rPr>
+              <w:br/>
+              <w:t xml:space="preserve">  publish(projectId: string, expectation: PublishExpectation): Promise&lt;ProjectAggregate&gt;;</w:t>
+            </w:r>
+            <w:r>
+              <w:rPr>
+                <w:rFonts w:ascii="Liberation Mono" w:hAnsi="Liberation Mono" w:eastAsia="Liberation Mono"/>
+                <w:color w:val="1F2937"/>
+                <w:sz w:val="14"/>
+              </w:rPr>
+              <w:br/>
+              <w:t xml:space="preserve">  restore(projectId: string, snapshotId: string): Promise&lt;StorefrontSnapshot&gt;;</w:t>
+            </w:r>
+            <w:r>
+              <w:rPr>
+                <w:rFonts w:ascii="Liberation Mono" w:hAnsi="Liberation Mono" w:eastAsia="Liberation Mono"/>
+                <w:color w:val="1F2937"/>
+                <w:sz w:val="14"/>
+              </w:rPr>
+              <w:br/>
               <w:t>}</w:t>
             </w:r>
           </w:p>
@@ -22200,7 +22213,7 @@
                 <w:rFonts w:ascii="Aptos" w:hAnsi="Aptos" w:eastAsia="Aptos"/>
                 <w:sz w:val="15"/>
               </w:rPr>
-              <w:t>The application MUST use strict TypeScript and schema validation at all AI and persistence boundaries.</w:t>
+              <w:t>The application MUST use strict TypeScript and schema validation at all AI and persistence boundaries, including atomic aggregate creation.</w:t>
             </w:r>
           </w:p>
         </w:tc>
@@ -24763,6 +24776,42 @@
           <w:p>
             <w:r>
               <w:t>A first-time user can understand section selection, proposal review, draft preview, Save draft, and Publish changes through the built-in tutorial without developer terminology.</w:t>
+            </w:r>
+          </w:p>
+        </w:tc>
+      </w:tr>
+      <w:tr>
+        <w:trPr>
+          <w:cantSplit/>
+        </w:trPr>
+        <w:tc>
+          <w:tcPr>
+            <w:tcW w:type="dxa" w:w="1224"/>
+            <w:vAlign w:val="top"/>
+            <w:shd w:fill="FAFAFB"/>
+          </w:tcPr>
+          <w:p>
+            <w:pPr>
+              <w:spacing w:after="0"/>
+            </w:pPr>
+            <w:r>
+              <w:rPr>
+                <w:rFonts w:ascii="Aptos" w:hAnsi="Aptos" w:eastAsia="Aptos"/>
+                <w:sz w:val="15"/>
+              </w:rPr>
+              <w:t>AC-023</w:t>
+            </w:r>
+          </w:p>
+        </w:tc>
+        <w:tc>
+          <w:tcPr>
+            <w:tcW w:type="dxa" w:w="8712"/>
+            <w:vAlign w:val="top"/>
+            <w:shd w:fill="FAFAFB"/>
+          </w:tcPr>
+          <w:p>
+            <w:r>
+              <w:t>A complete validated project aggregate can be created atomically through the repository; identity conflicts or validation failures leave existing projects, catalogues, snapshots and history unchanged.</w:t>
             </w:r>
           </w:p>
         </w:tc>

</xml_diff>

<commit_message>
feat(storefront): add generation review projection
</commit_message>
<xml_diff>
--- a/docs/VESKIFY_SDD_v1.1.docx
+++ b/docs/VESKIFY_SDD_v1.1.docx
@@ -29049,6 +29049,29 @@
     <w:p>
       <w:r>
         <w:t>Diagnostics retain their source stage and original stable code. Cross-stage brief IDs, selection fingerprint, template plan ID, BrandSystem and snapshot metadata are checked before exposure to the later onboarding review and project-creation handoff. Traceability: §4.1; §6.2 FR-009, FR-010, FR-011, FR-013–FR-016, FR-040, FR-051–FR-054; §12.8; §15.3–§15.5; §16.2, §16.5; §17.1; §21.2 AC-001, AC-002, AC-013, AC-016, AC-023, AC-024.</w:t>
+      </w:r>
+    </w:p>
+    <w:p>
+      <w:pPr>
+        <w:pStyle w:val="Heading1"/>
+      </w:pPr>
+      <w:r>
+        <w:t>P3-13 — Deterministic storefront generation review projection</w:t>
+      </w:r>
+    </w:p>
+    <w:p>
+      <w:r>
+        <w:t>The P3-10 guided-generation result is projected by a deterministic application service into an immutable localized EN/FI merchant review. The review preserves the original business values, brand foundation, template selection, materialized pages, languages, catalogue context, assumptions, warnings, blockers and stage-labelled diagnostics without rerunning planning or materialization.</w:t>
+      </w:r>
+    </w:p>
+    <w:p>
+      <w:r>
+        <w:t>The fixed review sections are business, brand-foundation, storefront-template, storefront-pages, languages, catalogue, assumptions, warnings and blockers. Project creation is allowed only for a valid non-blocked result with a generated snapshot, required home/collection/product pages and no blocker diagnostics. The review remains in memory for the later O-09 consumer and does not create or persist a Project.</w:t>
+      </w:r>
+    </w:p>
+    <w:p>
+      <w:r>
+        <w:t>Traceability: §4.1; §6.2 FR-009, FR-010, FR-011, FR-013–FR-016, FR-040, FR-053–FR-056; §12.8; §15.3–§15.5; §16.2, §16.5; §17.1; §21.2 AC-001, AC-002, AC-013, AC-016, AC-023–AC-026.</w:t>
       </w:r>
     </w:p>
     <w:sectPr>

</xml_diff>

<commit_message>
fix: validate onboarding locale boundaries and document O-08
</commit_message>
<xml_diff>
--- a/docs/VESKIFY_SDD_v1.1.docx
+++ b/docs/VESKIFY_SDD_v1.1.docx
@@ -5051,7 +5051,7 @@
         <w:rPr>
           <w:rFonts w:ascii="Aptos" w:hAnsi="Aptos" w:eastAsia="Aptos"/>
         </w:rPr>
-        <w:t>The system must save onboarding progress locally so an accidental refresh does not restart the flow.</w:t>
+        <w:t>The system must save onboarding progress locally so an accidental refresh does not restart the flow. O-08 language selections resume from the saved onboarding session; completion requires at least one supported storefront language and a primary language selected from that set, then advances atomically to O-09.</w:t>
       </w:r>
     </w:p>
     <w:p>
@@ -6538,7 +6538,7 @@
                 <w:rFonts w:ascii="Aptos" w:hAnsi="Aptos" w:eastAsia="Aptos"/>
                 <w:sz w:val="15"/>
               </w:rPr>
-              <w:t>English, Finnish or both; primary language selection.</w:t>
+              <w:t>English (en), Finnish (fi), or both in canonical order; one selected primary language. Unsupported runtime locales are rejected rather than filtered.</w:t>
             </w:r>
           </w:p>
         </w:tc>
@@ -6979,7 +6979,7 @@
                 <w:rFonts w:ascii="Aptos" w:hAnsi="Aptos" w:eastAsia="Aptos"/>
                 <w:sz w:val="15"/>
               </w:rPr>
-              <w:t>The onboarding flow MUST persist progress locally after every completed step.</w:t>
+              <w:t>The onboarding flow MUST persist progress locally after every completed step, including resumable O-08 language selections and completion.</w:t>
             </w:r>
           </w:p>
         </w:tc>
@@ -7104,7 +7104,7 @@
                 <w:rFonts w:ascii="Aptos" w:hAnsi="Aptos" w:eastAsia="Aptos"/>
                 <w:sz w:val="15"/>
               </w:rPr>
-              <w:t>The demo MUST support English and Finnish as storefront languages.</w:t>
+              <w:t>The demo MUST support only English (en) and Finnish (fi) as storefront locales; the primary language MUST be one of the selected locales, and unsupported runtime locale values MUST be rejected.</w:t>
             </w:r>
           </w:p>
         </w:tc>
@@ -18004,7 +18004,15 @@
         <w:rPr>
           <w:rFonts w:ascii="Aptos" w:hAnsi="Aptos" w:eastAsia="Aptos"/>
         </w:rPr>
-        <w:t>V1 supports English (en) and Finnish (fi). Every user-editable storefront content field uses a locale map. The project has one primary language and may enable the second language.</w:t>
+        <w:t>V1 supports only English (en) and Finnish (fi). Every user-editable storefront content field uses a locale map. The project has one primary language and may enable the second language. O-08 stores selected storefront locales in canonical en, then fi order and requires the primary language to be one of those selected locales before completion.</w:t>
+      </w:r>
+    </w:p>
+    <w:p>
+      <w:r>
+        <w:rPr>
+          <w:rFonts w:ascii="Aptos" w:hAnsi="Aptos" w:eastAsia="Aptos"/>
+        </w:rPr>
+        <w:t>The domain and onboarding application boundaries validate every runtime selected-language and primary-language value through the canonical locale schema before deduplication or ordering. Unsupported or malformed locale input is rejected with a typed validation error and is never silently filtered, repaired or replaced with a fallback; supported duplicate selections retain the existing normalization behaviour.</w:t>
       </w:r>
     </w:p>
     <w:p>
@@ -22200,7 +22208,7 @@
                 <w:rFonts w:ascii="Aptos" w:hAnsi="Aptos" w:eastAsia="Aptos"/>
                 <w:sz w:val="15"/>
               </w:rPr>
-              <w:t>The application MUST use strict TypeScript and schema validation at all AI and persistence boundaries.</w:t>
+              <w:t>The application MUST use strict TypeScript and schema validation at all AI, onboarding and persistence boundaries, including atomic aggregate creation; unsupported runtime locale values MUST NOT be filtered or silently repaired.</w:t>
             </w:r>
           </w:p>
         </w:tc>
@@ -24474,7 +24482,7 @@
                 <w:rFonts w:ascii="Aptos" w:hAnsi="Aptos" w:eastAsia="Aptos"/>
                 <w:sz w:val="15"/>
               </w:rPr>
-              <w:t>The user can switch between English and Finnish storefront content.</w:t>
+              <w:t>The user can switch between English and Finnish storefront content; the project retains one primary locale and may enable the second locale.</w:t>
             </w:r>
           </w:p>
         </w:tc>
@@ -29061,12 +29069,12 @@
     </w:p>
     <w:p>
       <w:r>
-        <w:t>The P3-10 guided-generation result is projected by a deterministic application service into an immutable localized EN/FI merchant review. The review preserves the original business values, brand foundation, template selection, materialized pages, languages, catalogue context, assumptions, warnings, blockers and stage-labelled diagnostics without rerunning planning or materialization.</w:t>
+        <w:t>The P3-10 guided-generation result is projected by a deterministic application service into an immutable localized EN/FI merchant review. The review preserves the original business values, brand foundation, template selection, materialized pages, canonical selected languages and primary language, catalogue context, assumptions, warnings, blockers and stage-labelled diagnostics without rerunning planning or materialization.</w:t>
       </w:r>
     </w:p>
     <w:p>
       <w:r>
-        <w:t>The fixed review sections are business, brand-foundation, storefront-template, storefront-pages, languages, catalogue, assumptions, warnings and blockers. Project creation is allowed only for a valid non-blocked result with a generated snapshot, required home/collection/product pages and no blocker diagnostics. The review remains in memory for the later O-09 consumer and does not create or persist a Project.</w:t>
+        <w:t>The fixed review sections are business, brand-foundation, storefront-template, storefront-pages, languages, catalogue, assumptions, warnings and blockers. Unsupported or malformed locale input is rejected before review or project-creation propagation. Project creation is allowed only for a valid non-blocked result with a generated snapshot, required home/collection/product pages and no blocker diagnostics. The review remains in memory for the later O-09 consumer and does not create or persist a Project.</w:t>
       </w:r>
     </w:p>
     <w:p>

</xml_diff>

<commit_message>
feat: add whole-storefront AI contract foundations
</commit_message>
<xml_diff>
--- a/docs/VESKIFY_SDD_v1.1.docx
+++ b/docs/VESKIFY_SDD_v1.1.docx
@@ -17263,6 +17263,42 @@
       <w:pPr>
         <w:spacing w:after="0"/>
       </w:pPr>
+    </w:p>
+    <w:p>
+      <w:pPr>
+        <w:spacing w:after="100"/>
+      </w:pPr>
+      <w:r>
+        <w:rPr>
+          <w:rFonts w:ascii="Aptos" w:hAnsi="Aptos" w:eastAsia="Aptos"/>
+          <w:sz w:val="20"/>
+        </w:rPr>
+        <w:t xml:space="preserve">P4-05A adds an additive, target-bound envelope for future whole-storefront proposals. The canonical target names one project and draft snapshot/revision, affected page IDs, optional page-bound section IDs, an optional explicit storefront design-system target, and enabled/active en and fi locales. Target identity uses deterministic page, section and locale ordering.</w:t>
+      </w:r>
+    </w:p>
+    <w:p>
+      <w:pPr>
+        <w:spacing w:after="100"/>
+      </w:pPr>
+      <w:r>
+        <w:rPr>
+          <w:rFonts w:ascii="Aptos" w:hAnsi="Aptos" w:eastAsia="Aptos"/>
+          <w:sz w:val="20"/>
+        </w:rPr>
+        <w:t xml:space="preserve">The envelope retains original and proposed storefront projections, affected pages, affected global design state, target-bound skill grants, target and permission fingerprints, contiguous operation ordering, and the existing pending/accepted/rejected lifecycle. It does not replace the current single-page provider, generation, confirmation, or proposal-store contracts.</w:t>
+      </w:r>
+    </w:p>
+    <w:p>
+      <w:pPr>
+        <w:spacing w:after="100"/>
+      </w:pPr>
+      <w:r>
+        <w:rPr>
+          <w:rFonts w:ascii="Aptos" w:hAnsi="Aptos" w:eastAsia="Aptos"/>
+          <w:sz w:val="20"/>
+        </w:rPr>
+        <w:t xml:space="preserve">Every operation and grant is checked against the declared storefront target. Section targets belong to their page, context-provided unknown pages and sections are rejected, page grants cannot authorize another page, and global operations require an explicit storefront design-system grant. Fingerprints use canonical serialization and exclude UI state, commerce/customer data, and secrets. P4-05B generation and P4-05C atomic multi-page application/history remain future work (FR-007, FR-020, FR-027, FR-040-FR-042, FR-050, NFR-006, NFR-009, AC-012, AC-013, AC-016).</w:t>
+      </w:r>
     </w:p>
     <w:p>
       <w:pPr>

</xml_diff>

<commit_message>
fix: harden storefront AI proposal validation
</commit_message>
<xml_diff>
--- a/docs/VESKIFY_SDD_v1.1.docx
+++ b/docs/VESKIFY_SDD_v1.1.docx
@@ -17269,11 +17269,7 @@
         <w:spacing w:after="100"/>
       </w:pPr>
       <w:r>
-        <w:rPr>
-          <w:rFonts w:ascii="Aptos" w:hAnsi="Aptos" w:eastAsia="Aptos"/>
-          <w:sz w:val="20"/>
-        </w:rPr>
-        <w:t xml:space="preserve">P4-05A adds an additive, target-bound envelope for future whole-storefront proposals. The canonical target names one project and draft snapshot/revision, affected page IDs, optional page-bound section IDs, an optional explicit storefront design-system target, and enabled/active en and fi locales. Target identity uses deterministic page, section and locale ordering.</w:t>
+        <w:t xml:space="preserve">The P4-05A storefront contract foundation adds an additive, target-bound envelope for future whole-storefront proposals. Its canonical target names one project and draft snapshot/revision, the affected page IDs, globally unambiguous page-bound section IDs, an optional explicit storefront design-system target, and the enabled/active `en` and `fi` locales. Target identity is normalized to deterministic page, section and locale ordering. The target fingerprint includes the nullable design-system target. The envelope retains the original and proposed storefront projections, affected pages, affected global design state, target-bound skill grants, target and permission fingerprints, contiguous operation ordering, and the existing `pending`/`accepted`/`rejected` proposal lifecycle. The raw envelope may retain provider validation failures for diagnostics; only a proposal with `valid: true` and no validation errors may cross the ready-proposal boundary. It is additive to the current single-page provider, generation and confirmation contracts; it does not apply multi-page changes or create a second proposal store.</w:t>
       </w:r>
     </w:p>
     <w:p>
@@ -17281,11 +17277,7 @@
         <w:spacing w:after="100"/>
       </w:pPr>
       <w:r>
-        <w:rPr>
-          <w:rFonts w:ascii="Aptos" w:hAnsi="Aptos" w:eastAsia="Aptos"/>
-          <w:sz w:val="20"/>
-        </w:rPr>
-        <w:t xml:space="preserve">The envelope retains original and proposed storefront projections, affected pages, affected global design state, target-bound skill grants, target and permission fingerprints, contiguous operation ordering, and the existing pending/accepted/rejected lifecycle. It does not replace the current single-page provider, generation, confirmation, or proposal-store contracts.</w:t>
+        <w:t xml:space="preserve">Every storefront operation and grant is validated against the declared target. Section targets must belong to their declared page, section IDs must be unique across the complete storefront, unknown pages and sections are rejected when an active projection is supplied, page grants cannot authorize another page, and global operations require an explicit storefront design-system grant. Unsupported, duplicate or conflicting target grants are rejected; no global flattened allow-list, silent filtering, commerce/customer data or secret enters the fingerprint context. Ready-proposal validation recomputes both target and permission fingerprints from the active canonical context and rejects stale or tampered values.</w:t>
       </w:r>
     </w:p>
     <w:p>
@@ -17293,11 +17285,7 @@
         <w:spacing w:after="100"/>
       </w:pPr>
       <w:r>
-        <w:rPr>
-          <w:rFonts w:ascii="Aptos" w:hAnsi="Aptos" w:eastAsia="Aptos"/>
-          <w:sz w:val="20"/>
-        </w:rPr>
-        <w:t xml:space="preserve">Every operation and grant is checked against the declared storefront target. Section targets belong to their page, context-provided unknown pages and sections are rejected, page grants cannot authorize another page, and global operations require an explicit storefront design-system grant. Fingerprints use canonical serialization and exclude UI state, commerce/customer data, and secrets. P4-05B generation and P4-05C atomic multi-page application/history remain future work (FR-007, FR-020, FR-027, FR-040-FR-042, FR-050, NFR-006, NFR-009, AC-012, AC-013, AC-016).</w:t>
+        <w:t xml:space="preserve">The proposed projection must preserve the complete page set, page order and navigation, and every page outside the declared target must remain canonically unchanged. A page reorder must name exactly the page's current section IDs once each. Section operations are validated sequentially against an isolated working page through the existing design-operation and component-registry rules. An introduced section may therefore be customized only after a valid add in the same sequence and with an introduced-section grant matching its registered component and target page. Use-before-add, duplicate or cross-page section identities, grant-kind or component mismatches, unknown or page-incompatible components, unsupported variants or fields, protected fields, and malformed operation values are rejected before review or draft mutation. Generation remains P4-05B work; atomic multi-page draft application and site-wide history remain P4-05C work (FR-007, FR-014, FR-015, FR-016, FR-020, FR-027, FR-040, FR-041, FR-042, FR-050, NFR-006, NFR-009, AC-012, AC-013, AC-016).</w:t>
       </w:r>
     </w:p>
     <w:p>

</xml_diff>

<commit_message>
feat: add atomic storefront proposal application
</commit_message>
<xml_diff>
--- a/docs/VESKIFY_SDD_v1.1.docx
+++ b/docs/VESKIFY_SDD_v1.1.docx
@@ -17285,7 +17285,23 @@
         <w:spacing w:after="100"/>
       </w:pPr>
       <w:r>
-        <w:t xml:space="preserve">The proposed projection must preserve the complete page set, page order and navigation, and every page outside the declared target must remain canonically unchanged. A page reorder must name exactly the page's current section IDs once each. Section operations are validated sequentially against an isolated working page through the existing design-operation and component-registry rules. An introduced section may therefore be customized only after a valid add in the same sequence and with an introduced-section grant matching its registered component and target page. Use-before-add, duplicate or cross-page section identities, grant-kind or component mismatches, unknown or page-incompatible components, unsupported variants or fields, protected fields, and malformed operation values are rejected before review or draft mutation. Generation remains P4-05B work; atomic multi-page draft application and site-wide history remain P4-05C work (FR-007, FR-014, FR-015, FR-016, FR-020, FR-027, FR-040, FR-041, FR-042, FR-050, NFR-006, NFR-009, AC-012, AC-013, AC-016).</w:t>
+        <w:t xml:space="preserve">The proposed projection must preserve the complete page set, page order and navigation, and every page outside the declared target must remain canonically unchanged. A page reorder must name exactly the page's current section IDs once each. Section operations are validated sequentially against an isolated working page through the existing design-operation and component-registry rules. An introduced section may therefore be customized only after a valid add in the same sequence and with an introduced-section grant matching its registered component and target page. Use-before-add, duplicate or cross-page section identities, grant-kind or component mismatches, unknown or page-incompatible components, unsupported variants or fields, protected fields, and malformed operation values are rejected before review or draft mutation. Generation remains P4-05B work; provider-driven whole-storefront generation remains separate from application (FR-007, FR-014, FR-015, FR-016, FR-020, FR-027, FR-040, FR-041, FR-042, FR-050, NFR-006, NFR-009, AC-012, AC-013, AC-016).</w:t>
+      </w:r>
+    </w:p>
+    <w:p>
+      <w:pPr>
+        <w:spacing w:after="100"/>
+      </w:pPr>
+      <w:r>
+        <w:t xml:space="preserve">The P4-05C application boundary accepts one validated pending whole-storefront proposal as one all-or-nothing active-draft transaction. It rechecks project and draft identity, complete original storefront state, target and permission fingerprints, target-bound grants, operation ordering, registered components, protected fields, and final projection equality before commit. Operations run sequentially against an isolated complete snapshot. Explicitly targeted colour and typography design state requires the declared storefront design-system target and matching grant. The complete result must preserve snapshot and catalogue identity, page set/order, navigation, untargeted pages, unrelated design state, and storefront-wide section uniqueness. Failure returns no result mutation.</w:t>
+      </w:r>
+    </w:p>
+    <w:p>
+      <w:pPr>
+        <w:spacing w:after="100"/>
+      </w:pPr>
+      <w:r>
+        <w:t xml:space="preserve">One accepted whole-storefront proposal creates one session-only composite history transaction with all affected before/after pages, complete before/after design state, unaffected-page fingerprints, draft context, timestamp, proposal identity, and complete storefront fingerprints. Commit validates both forward application and inverse restoration before changing history. Undo and Redo restore the entire transaction as one unit; partial page undo/redo is not possible. Existing single-page proposal confirmation and page-local history remain unchanged. Acceptance changes only active in-memory draft state; Save draft, publishing, published history, and restore remain explicit separate boundaries (FR-026, FR-028, FR-041, FR-042, FR-044-FR-050, NFR-006, NFR-009, AC-006, AC-008-AC-012, AC-016).</w:t>
       </w:r>
     </w:p>
     <w:p>
@@ -17801,6 +17817,14 @@
       <w:pPr>
         <w:spacing w:after="0"/>
       </w:pPr>
+    </w:p>
+    <w:p>
+      <w:pPr>
+        <w:spacing w:after="100"/>
+      </w:pPr>
+      <w:r>
+        <w:t xml:space="preserve">A composite editor transaction is a session-only whole-storefront unit containing before/after affected pages and design state. It applies, undoes, and redoes only active-draft state as one unit.</w:t>
+      </w:r>
     </w:p>
     <w:p>
       <w:pPr>
@@ -20696,6 +20720,14 @@
     </w:p>
     <w:p>
       <w:pPr>
+        <w:spacing w:after="100"/>
+      </w:pPr>
+      <w:r>
+        <w:t xml:space="preserve">Whole-storefront proposal acceptance uses a complete cloned StorefrontSnapshot and one composite history transaction. The application validates the exact forward and inverse storefront states before changing active session state. It never approximates atomicity through independent page commits and never writes saved or published state.</w:t>
+      </w:r>
+    </w:p>
+    <w:p>
+      <w:pPr>
         <w:pStyle w:val="Heading2"/>
         <w:keepNext/>
         <w:keepLines/>
@@ -21296,6 +21328,14 @@
       <w:pPr>
         <w:spacing w:after="0"/>
       </w:pPr>
+    </w:p>
+    <w:p>
+      <w:pPr>
+        <w:spacing w:after="100"/>
+      </w:pPr>
+      <w:r>
+        <w:t xml:space="preserve">applyStorefrontProposal(context, proposal) atomically validates and applies one whole-storefront proposal to the complete active draft and records one composite session-history transaction; it does not save or publish.</w:t>
+      </w:r>
     </w:p>
     <w:p>
       <w:pPr>

</xml_diff>

<commit_message>
feat: add Karvonen demo catalogue seed
</commit_message>
<xml_diff>
--- a/docs/VESKIFY_SDD_v1.1.docx
+++ b/docs/VESKIFY_SDD_v1.1.docx
@@ -1,6 +1,6 @@
 
 <file path=word/document.xml><?xml version="1.0" encoding="utf-8"?>
-<w:document xmlns:ve="http://schemas.openxmlformats.org/markup-compatibility/2006" xmlns:o="urn:schemas-microsoft-com:office:office" xmlns:r="http://schemas.openxmlformats.org/officeDocument/2006/relationships" xmlns:v="urn:schemas-microsoft-com:vml" xmlns:wp="http://schemas.openxmlformats.org/drawingml/2006/wordprocessingDrawing" xmlns:w10="urn:schemas-microsoft-com:office:word" xmlns:w="http://schemas.openxmlformats.org/wordprocessingml/2006/main">
+<w:document xmlns:w="http://schemas.openxmlformats.org/wordprocessingml/2006/main">
   <w:body>
     <w:p>
       <w:pPr/>
@@ -15350,12 +15350,7 @@
     <w:p>
       <w:pPr/>
       <w:r>
-        <w:rPr>
-          <w:rFonts w:ascii="Helvetica Light" w:hAnsi="Helvetica Light" w:cs="Helvetica Light"/>
-          <w:sz w:val="24"/>
-          <w:sz-cs w:val="24"/>
-        </w:rPr>
-        <w:t xml:space="preserve">&lt;th&gt;type ProductDisplayModel = {&lt;br /&gt;</w:t>
+        <w:t>type ProductDisplayModel = { id: string; sku?: string; title: LocalizedText; description?: LocalizedText; brand?: string; category?: string; price?: { amount: number; currency: "EUR" }; // exactly one with priceUnavailableReason; read-only compareAtPrice?: { amount: number; currency: "EUR" }; // read-only priceUnavailableReason?: LocalizedText; // exactly one with price availabilityLabel?: LocalizedText; // read-only display label stockStatus?: "inStock" | "lowStock" | "outOfStock"; // read-only dummy display images: AssetRef[]; productType: string; attributes: Record&lt;string, string | number | string[]&gt;; variants: ProductVariantDisplay[]; orderOptions?: ProductOrderOptionDisplay[]; seo?: LocalizedSEO; };</w:t>
       </w:r>
     </w:p>
     <w:p>
@@ -15565,6 +15560,11 @@
           <w:sz-cs w:val="24"/>
         </w:rPr>
         <w:t xml:space="preserve"/>
+      </w:r>
+    </w:p>
+    <w:p>
+      <w:r>
+        <w:t>type ProductVariantDisplay = { id: string; label: LocalizedText; attributes: Record&lt;string, string | number | string[]&gt;; price?: { amount: number; currency: "EUR" }; // read-only }; Every product provides exactly one of price or priceUnavailableReason; both missing or both present are invalid. Collection membership remains in the canonical collections model, and material, colour and stone details remain in attributes.</w:t>
       </w:r>
     </w:p>
     <w:p>

</xml_diff>

<commit_message>
fix: guard Karvonen seed identifier conflicts
</commit_message>
<xml_diff>
--- a/docs/VESKIFY_SDD_v1.1.docx
+++ b/docs/VESKIFY_SDD_v1.1.docx
@@ -9108,6 +9108,11 @@
           <w:sz-cs w:val="24"/>
         </w:rPr>
         <w:t xml:space="preserve"/>
+      </w:r>
+    </w:p>
+    <w:p>
+      <w:r>
+        <w:t>- Local/default demo bootstrap includes both the canonical Aurum Nordic and Karvonen demo projects. Existing projects and merchant edits are preserved; if any canonical Karvonen seed identifier is already occupied, the complete Karvonen seed aggregate is skipped to prevent unsafe insertion.</w:t>
       </w:r>
     </w:p>
     <w:p>

</xml_diff>